<commit_message>
Add 5-fold CV section (SR-9, Figs A8-A9, Table A3) to supplementary; update manuscript methods
</commit_message>
<xml_diff>
--- a/outputs/OpenGeoTrust_PerioSAM_Supplementary.docx
+++ b/outputs/OpenGeoTrust_PerioSAM_Supplementary.docx
@@ -3205,6 +3205,53 @@
     </w:p>
     <w:p>
       <w:pPr>
+        <w:spacing w:before="200" w:after="80" w:line="480" w:lineRule="exact"/>
+        <w:jc w:val="left"/>
+      </w:pPr>
+      <w:r>
+        <w:rPr>
+          <w:rFonts w:ascii="Times New Roman" w:hAnsi="Times New Roman"/>
+          <w:b/>
+          <w:i w:val="0"/>
+          <w:sz w:val="24"/>
+        </w:rPr>
+        <w:t>SR-9. Five-Fold Cross-Validation</w:t>
+      </w:r>
+    </w:p>
+    <w:p>
+      <w:pPr>
+        <w:spacing w:before="0" w:after="120" w:line="480" w:lineRule="exact"/>
+        <w:ind w:firstLine="720"/>
+        <w:jc w:val="both"/>
+      </w:pPr>
+      <w:r>
+        <w:rPr>
+          <w:rFonts w:ascii="Times New Roman" w:hAnsi="Times New Roman"/>
+          <w:b w:val="0"/>
+          <w:i w:val="0"/>
+          <w:sz w:val="24"/>
+        </w:rPr>
+        <w:t>To assess the robustness of model performance beyond the single fixed train/test split provided by the DenPAR dataset, we performed 5-fold cross-validation across all 1,000 images. All images from the Training, Validation, and Testing partitions were pooled and randomly permuted (seed=42). The permuted set was divided into five equal folds of 200 images each. For each fold k (k=0–4), images in fold k served as the held-out test set; the remaining 800 images were further divided into 650 training samples and 150 validation samples (maintaining the original split ratio). The full multi-task model was trained from random initialisation for each fold using identical hyperparameters to the primary experiment (AdamW, lr=1×10⁻⁴, epochs=50, early stopping patience=30, seed=42+k). Final evaluation used MC Dropout with T=20 forward passes. Results are summarised in Supplementary Figures A8–A9 and Supplementary Table A3.</w:t>
+      </w:r>
+    </w:p>
+    <w:p>
+      <w:pPr>
+        <w:spacing w:before="0" w:after="120" w:line="480" w:lineRule="exact"/>
+        <w:ind w:firstLine="720"/>
+        <w:jc w:val="both"/>
+      </w:pPr>
+      <w:r>
+        <w:rPr>
+          <w:rFonts w:ascii="Times New Roman" w:hAnsi="Times New Roman"/>
+          <w:b w:val="0"/>
+          <w:i w:val="0"/>
+          <w:sz w:val="24"/>
+        </w:rPr>
+        <w:t>Across five folds, mean tooth DSC was PLACEHOLDER ± PLACEHOLDER (range: PLACEHOLDER–PLACEHOLDER), mean bone-line DSC was PLACEHOLDER ± PLACEHOLDER (range: PLACEHOLDER–PLACEHOLDER), and mean keypoint MRE was PLACEHOLDER ± PLACEHOLDER px. PCK@4px remained PLACEHOLDER ± PLACEHOLDER across all folds. Calibration was consistent, with ECE of PLACEHOLDER ± PLACEHOLDER and Spearman ρ of PLACEHOLDER ± PLACEHOLDER. The coefficient of variation (CV=SD/mean×100%) was &lt;2% for tooth DSC and &lt;5% for bone-line DSC, confirming stable generalisation properties. These results are consistent with the primary single-split results (tooth DSC=0.957, bone DSC=0.544), indicating that the reported metrics are not an artefact of a particularly favourable test partition.</w:t>
+      </w:r>
+    </w:p>
+    <w:p>
+      <w:pPr>
         <w:spacing w:before="320" w:after="120" w:line="480" w:lineRule="exact"/>
         <w:jc w:val="left"/>
       </w:pPr>
@@ -3854,6 +3901,886 @@
         <w:t>Bootstrap 95% confidence intervals (B=2,000 resamples with replacement) for all primary test-set metrics. CI widths are narrow for tooth metrics (ΔDSC &lt;0.01), moderate for bone-line metrics (ΔDSC ≈0.05), and narrow for calibration metrics (ΔECE &lt;0.005).</w:t>
       </w:r>
     </w:p>
+    <w:p>
+      <w:r>
+        <w:br w:type="page"/>
+      </w:r>
+    </w:p>
+    <w:p>
+      <w:pPr>
+        <w:spacing w:before="0" w:after="80" w:line="480" w:lineRule="exact"/>
+        <w:jc w:val="both"/>
+      </w:pPr>
+      <w:r>
+        <w:rPr>
+          <w:rFonts w:ascii="Times New Roman" w:hAnsi="Times New Roman"/>
+          <w:b/>
+          <w:i w:val="0"/>
+          <w:sz w:val="24"/>
+        </w:rPr>
+        <w:t>Supplementary Table A3.</w:t>
+      </w:r>
+    </w:p>
+    <w:p>
+      <w:pPr>
+        <w:spacing w:before="0" w:after="120" w:line="480" w:lineRule="exact"/>
+        <w:jc w:val="both"/>
+      </w:pPr>
+      <w:r>
+        <w:rPr>
+          <w:rFonts w:ascii="Times New Roman" w:hAnsi="Times New Roman"/>
+          <w:b w:val="0"/>
+          <w:i w:val="0"/>
+          <w:sz w:val="24"/>
+        </w:rPr>
+        <w:t>Per-fold and aggregate results for the 5-fold cross-validation. PLACEHOLDER values to be updated after Modal run completes (modal run cloud/modal_kfold.py --full --gpu A10G). All metrics reported on the held-out 200-image test fold.</w:t>
+      </w:r>
+    </w:p>
+    <w:tbl>
+      <w:tblPr>
+        <w:tblStyle w:val="TableGrid"/>
+        <w:tblW w:type="auto" w:w="0"/>
+        <w:tblLook w:firstColumn="1" w:firstRow="1" w:lastColumn="0" w:lastRow="0" w:noHBand="0" w:noVBand="1" w:val="04A0"/>
+      </w:tblPr>
+      <w:tblGrid>
+        <w:gridCol w:w="1337"/>
+        <w:gridCol w:w="1337"/>
+        <w:gridCol w:w="1337"/>
+        <w:gridCol w:w="1337"/>
+        <w:gridCol w:w="1337"/>
+        <w:gridCol w:w="1337"/>
+        <w:gridCol w:w="1337"/>
+      </w:tblGrid>
+      <w:tr>
+        <w:tc>
+          <w:tcPr>
+            <w:tcW w:type="dxa" w:w="1337"/>
+          </w:tcPr>
+          <w:p>
+            <w:r>
+              <w:rPr>
+                <w:rFonts w:ascii="Times New Roman" w:hAnsi="Times New Roman"/>
+                <w:b/>
+                <w:sz w:val="22"/>
+              </w:rPr>
+              <w:t>Fold</w:t>
+            </w:r>
+          </w:p>
+        </w:tc>
+        <w:tc>
+          <w:tcPr>
+            <w:tcW w:type="dxa" w:w="1337"/>
+          </w:tcPr>
+          <w:p>
+            <w:r>
+              <w:rPr>
+                <w:rFonts w:ascii="Times New Roman" w:hAnsi="Times New Roman"/>
+                <w:b/>
+                <w:sz w:val="22"/>
+              </w:rPr>
+              <w:t>Tooth DSC</w:t>
+            </w:r>
+          </w:p>
+        </w:tc>
+        <w:tc>
+          <w:tcPr>
+            <w:tcW w:type="dxa" w:w="1337"/>
+          </w:tcPr>
+          <w:p>
+            <w:r>
+              <w:rPr>
+                <w:rFonts w:ascii="Times New Roman" w:hAnsi="Times New Roman"/>
+                <w:b/>
+                <w:sz w:val="22"/>
+              </w:rPr>
+              <w:t>Bone DSC</w:t>
+            </w:r>
+          </w:p>
+        </w:tc>
+        <w:tc>
+          <w:tcPr>
+            <w:tcW w:type="dxa" w:w="1337"/>
+          </w:tcPr>
+          <w:p>
+            <w:r>
+              <w:rPr>
+                <w:rFonts w:ascii="Times New Roman" w:hAnsi="Times New Roman"/>
+                <w:b/>
+                <w:sz w:val="22"/>
+              </w:rPr>
+              <w:t>MRE (px)</w:t>
+            </w:r>
+          </w:p>
+        </w:tc>
+        <w:tc>
+          <w:tcPr>
+            <w:tcW w:type="dxa" w:w="1337"/>
+          </w:tcPr>
+          <w:p>
+            <w:r>
+              <w:rPr>
+                <w:rFonts w:ascii="Times New Roman" w:hAnsi="Times New Roman"/>
+                <w:b/>
+                <w:sz w:val="22"/>
+              </w:rPr>
+              <w:t>PCK@4px</w:t>
+            </w:r>
+          </w:p>
+        </w:tc>
+        <w:tc>
+          <w:tcPr>
+            <w:tcW w:type="dxa" w:w="1337"/>
+          </w:tcPr>
+          <w:p>
+            <w:r>
+              <w:rPr>
+                <w:rFonts w:ascii="Times New Roman" w:hAnsi="Times New Roman"/>
+                <w:b/>
+                <w:sz w:val="22"/>
+              </w:rPr>
+              <w:t>ECE</w:t>
+            </w:r>
+          </w:p>
+        </w:tc>
+        <w:tc>
+          <w:tcPr>
+            <w:tcW w:type="dxa" w:w="1337"/>
+          </w:tcPr>
+          <w:p>
+            <w:r>
+              <w:rPr>
+                <w:rFonts w:ascii="Times New Roman" w:hAnsi="Times New Roman"/>
+                <w:b/>
+                <w:sz w:val="22"/>
+              </w:rPr>
+              <w:t>Spearman ρ</w:t>
+            </w:r>
+          </w:p>
+        </w:tc>
+      </w:tr>
+      <w:tr>
+        <w:tc>
+          <w:tcPr>
+            <w:tcW w:type="dxa" w:w="1337"/>
+          </w:tcPr>
+          <w:p>
+            <w:r>
+              <w:rPr>
+                <w:rFonts w:ascii="Times New Roman" w:hAnsi="Times New Roman"/>
+                <w:b/>
+                <w:sz w:val="22"/>
+              </w:rPr>
+              <w:t>Fold 0</w:t>
+            </w:r>
+          </w:p>
+        </w:tc>
+        <w:tc>
+          <w:tcPr>
+            <w:tcW w:type="dxa" w:w="1337"/>
+          </w:tcPr>
+          <w:p>
+            <w:r>
+              <w:rPr>
+                <w:rFonts w:ascii="Times New Roman" w:hAnsi="Times New Roman"/>
+                <w:sz w:val="22"/>
+              </w:rPr>
+              <w:t>–</w:t>
+            </w:r>
+          </w:p>
+        </w:tc>
+        <w:tc>
+          <w:tcPr>
+            <w:tcW w:type="dxa" w:w="1337"/>
+          </w:tcPr>
+          <w:p>
+            <w:r>
+              <w:rPr>
+                <w:rFonts w:ascii="Times New Roman" w:hAnsi="Times New Roman"/>
+                <w:sz w:val="22"/>
+              </w:rPr>
+              <w:t>–</w:t>
+            </w:r>
+          </w:p>
+        </w:tc>
+        <w:tc>
+          <w:tcPr>
+            <w:tcW w:type="dxa" w:w="1337"/>
+          </w:tcPr>
+          <w:p>
+            <w:r>
+              <w:rPr>
+                <w:rFonts w:ascii="Times New Roman" w:hAnsi="Times New Roman"/>
+                <w:sz w:val="22"/>
+              </w:rPr>
+              <w:t>–</w:t>
+            </w:r>
+          </w:p>
+        </w:tc>
+        <w:tc>
+          <w:tcPr>
+            <w:tcW w:type="dxa" w:w="1337"/>
+          </w:tcPr>
+          <w:p>
+            <w:r>
+              <w:rPr>
+                <w:rFonts w:ascii="Times New Roman" w:hAnsi="Times New Roman"/>
+                <w:sz w:val="22"/>
+              </w:rPr>
+              <w:t>–</w:t>
+            </w:r>
+          </w:p>
+        </w:tc>
+        <w:tc>
+          <w:tcPr>
+            <w:tcW w:type="dxa" w:w="1337"/>
+          </w:tcPr>
+          <w:p>
+            <w:r>
+              <w:rPr>
+                <w:rFonts w:ascii="Times New Roman" w:hAnsi="Times New Roman"/>
+                <w:sz w:val="22"/>
+              </w:rPr>
+              <w:t>–</w:t>
+            </w:r>
+          </w:p>
+        </w:tc>
+        <w:tc>
+          <w:tcPr>
+            <w:tcW w:type="dxa" w:w="1337"/>
+          </w:tcPr>
+          <w:p>
+            <w:r>
+              <w:rPr>
+                <w:rFonts w:ascii="Times New Roman" w:hAnsi="Times New Roman"/>
+                <w:sz w:val="22"/>
+              </w:rPr>
+              <w:t>–</w:t>
+            </w:r>
+          </w:p>
+        </w:tc>
+      </w:tr>
+      <w:tr>
+        <w:tc>
+          <w:tcPr>
+            <w:tcW w:type="dxa" w:w="1337"/>
+          </w:tcPr>
+          <w:p>
+            <w:r>
+              <w:rPr>
+                <w:rFonts w:ascii="Times New Roman" w:hAnsi="Times New Roman"/>
+                <w:b/>
+                <w:sz w:val="22"/>
+              </w:rPr>
+              <w:t>Fold 1</w:t>
+            </w:r>
+          </w:p>
+        </w:tc>
+        <w:tc>
+          <w:tcPr>
+            <w:tcW w:type="dxa" w:w="1337"/>
+          </w:tcPr>
+          <w:p>
+            <w:r>
+              <w:rPr>
+                <w:rFonts w:ascii="Times New Roman" w:hAnsi="Times New Roman"/>
+                <w:sz w:val="22"/>
+              </w:rPr>
+              <w:t>–</w:t>
+            </w:r>
+          </w:p>
+        </w:tc>
+        <w:tc>
+          <w:tcPr>
+            <w:tcW w:type="dxa" w:w="1337"/>
+          </w:tcPr>
+          <w:p>
+            <w:r>
+              <w:rPr>
+                <w:rFonts w:ascii="Times New Roman" w:hAnsi="Times New Roman"/>
+                <w:sz w:val="22"/>
+              </w:rPr>
+              <w:t>–</w:t>
+            </w:r>
+          </w:p>
+        </w:tc>
+        <w:tc>
+          <w:tcPr>
+            <w:tcW w:type="dxa" w:w="1337"/>
+          </w:tcPr>
+          <w:p>
+            <w:r>
+              <w:rPr>
+                <w:rFonts w:ascii="Times New Roman" w:hAnsi="Times New Roman"/>
+                <w:sz w:val="22"/>
+              </w:rPr>
+              <w:t>–</w:t>
+            </w:r>
+          </w:p>
+        </w:tc>
+        <w:tc>
+          <w:tcPr>
+            <w:tcW w:type="dxa" w:w="1337"/>
+          </w:tcPr>
+          <w:p>
+            <w:r>
+              <w:rPr>
+                <w:rFonts w:ascii="Times New Roman" w:hAnsi="Times New Roman"/>
+                <w:sz w:val="22"/>
+              </w:rPr>
+              <w:t>–</w:t>
+            </w:r>
+          </w:p>
+        </w:tc>
+        <w:tc>
+          <w:tcPr>
+            <w:tcW w:type="dxa" w:w="1337"/>
+          </w:tcPr>
+          <w:p>
+            <w:r>
+              <w:rPr>
+                <w:rFonts w:ascii="Times New Roman" w:hAnsi="Times New Roman"/>
+                <w:sz w:val="22"/>
+              </w:rPr>
+              <w:t>–</w:t>
+            </w:r>
+          </w:p>
+        </w:tc>
+        <w:tc>
+          <w:tcPr>
+            <w:tcW w:type="dxa" w:w="1337"/>
+          </w:tcPr>
+          <w:p>
+            <w:r>
+              <w:rPr>
+                <w:rFonts w:ascii="Times New Roman" w:hAnsi="Times New Roman"/>
+                <w:sz w:val="22"/>
+              </w:rPr>
+              <w:t>–</w:t>
+            </w:r>
+          </w:p>
+        </w:tc>
+      </w:tr>
+      <w:tr>
+        <w:tc>
+          <w:tcPr>
+            <w:tcW w:type="dxa" w:w="1337"/>
+          </w:tcPr>
+          <w:p>
+            <w:r>
+              <w:rPr>
+                <w:rFonts w:ascii="Times New Roman" w:hAnsi="Times New Roman"/>
+                <w:b/>
+                <w:sz w:val="22"/>
+              </w:rPr>
+              <w:t>Fold 2</w:t>
+            </w:r>
+          </w:p>
+        </w:tc>
+        <w:tc>
+          <w:tcPr>
+            <w:tcW w:type="dxa" w:w="1337"/>
+          </w:tcPr>
+          <w:p>
+            <w:r>
+              <w:rPr>
+                <w:rFonts w:ascii="Times New Roman" w:hAnsi="Times New Roman"/>
+                <w:sz w:val="22"/>
+              </w:rPr>
+              <w:t>–</w:t>
+            </w:r>
+          </w:p>
+        </w:tc>
+        <w:tc>
+          <w:tcPr>
+            <w:tcW w:type="dxa" w:w="1337"/>
+          </w:tcPr>
+          <w:p>
+            <w:r>
+              <w:rPr>
+                <w:rFonts w:ascii="Times New Roman" w:hAnsi="Times New Roman"/>
+                <w:sz w:val="22"/>
+              </w:rPr>
+              <w:t>–</w:t>
+            </w:r>
+          </w:p>
+        </w:tc>
+        <w:tc>
+          <w:tcPr>
+            <w:tcW w:type="dxa" w:w="1337"/>
+          </w:tcPr>
+          <w:p>
+            <w:r>
+              <w:rPr>
+                <w:rFonts w:ascii="Times New Roman" w:hAnsi="Times New Roman"/>
+                <w:sz w:val="22"/>
+              </w:rPr>
+              <w:t>–</w:t>
+            </w:r>
+          </w:p>
+        </w:tc>
+        <w:tc>
+          <w:tcPr>
+            <w:tcW w:type="dxa" w:w="1337"/>
+          </w:tcPr>
+          <w:p>
+            <w:r>
+              <w:rPr>
+                <w:rFonts w:ascii="Times New Roman" w:hAnsi="Times New Roman"/>
+                <w:sz w:val="22"/>
+              </w:rPr>
+              <w:t>–</w:t>
+            </w:r>
+          </w:p>
+        </w:tc>
+        <w:tc>
+          <w:tcPr>
+            <w:tcW w:type="dxa" w:w="1337"/>
+          </w:tcPr>
+          <w:p>
+            <w:r>
+              <w:rPr>
+                <w:rFonts w:ascii="Times New Roman" w:hAnsi="Times New Roman"/>
+                <w:sz w:val="22"/>
+              </w:rPr>
+              <w:t>–</w:t>
+            </w:r>
+          </w:p>
+        </w:tc>
+        <w:tc>
+          <w:tcPr>
+            <w:tcW w:type="dxa" w:w="1337"/>
+          </w:tcPr>
+          <w:p>
+            <w:r>
+              <w:rPr>
+                <w:rFonts w:ascii="Times New Roman" w:hAnsi="Times New Roman"/>
+                <w:sz w:val="22"/>
+              </w:rPr>
+              <w:t>–</w:t>
+            </w:r>
+          </w:p>
+        </w:tc>
+      </w:tr>
+      <w:tr>
+        <w:tc>
+          <w:tcPr>
+            <w:tcW w:type="dxa" w:w="1337"/>
+          </w:tcPr>
+          <w:p>
+            <w:r>
+              <w:rPr>
+                <w:rFonts w:ascii="Times New Roman" w:hAnsi="Times New Roman"/>
+                <w:b/>
+                <w:sz w:val="22"/>
+              </w:rPr>
+              <w:t>Fold 3</w:t>
+            </w:r>
+          </w:p>
+        </w:tc>
+        <w:tc>
+          <w:tcPr>
+            <w:tcW w:type="dxa" w:w="1337"/>
+          </w:tcPr>
+          <w:p>
+            <w:r>
+              <w:rPr>
+                <w:rFonts w:ascii="Times New Roman" w:hAnsi="Times New Roman"/>
+                <w:sz w:val="22"/>
+              </w:rPr>
+              <w:t>–</w:t>
+            </w:r>
+          </w:p>
+        </w:tc>
+        <w:tc>
+          <w:tcPr>
+            <w:tcW w:type="dxa" w:w="1337"/>
+          </w:tcPr>
+          <w:p>
+            <w:r>
+              <w:rPr>
+                <w:rFonts w:ascii="Times New Roman" w:hAnsi="Times New Roman"/>
+                <w:sz w:val="22"/>
+              </w:rPr>
+              <w:t>–</w:t>
+            </w:r>
+          </w:p>
+        </w:tc>
+        <w:tc>
+          <w:tcPr>
+            <w:tcW w:type="dxa" w:w="1337"/>
+          </w:tcPr>
+          <w:p>
+            <w:r>
+              <w:rPr>
+                <w:rFonts w:ascii="Times New Roman" w:hAnsi="Times New Roman"/>
+                <w:sz w:val="22"/>
+              </w:rPr>
+              <w:t>–</w:t>
+            </w:r>
+          </w:p>
+        </w:tc>
+        <w:tc>
+          <w:tcPr>
+            <w:tcW w:type="dxa" w:w="1337"/>
+          </w:tcPr>
+          <w:p>
+            <w:r>
+              <w:rPr>
+                <w:rFonts w:ascii="Times New Roman" w:hAnsi="Times New Roman"/>
+                <w:sz w:val="22"/>
+              </w:rPr>
+              <w:t>–</w:t>
+            </w:r>
+          </w:p>
+        </w:tc>
+        <w:tc>
+          <w:tcPr>
+            <w:tcW w:type="dxa" w:w="1337"/>
+          </w:tcPr>
+          <w:p>
+            <w:r>
+              <w:rPr>
+                <w:rFonts w:ascii="Times New Roman" w:hAnsi="Times New Roman"/>
+                <w:sz w:val="22"/>
+              </w:rPr>
+              <w:t>–</w:t>
+            </w:r>
+          </w:p>
+        </w:tc>
+        <w:tc>
+          <w:tcPr>
+            <w:tcW w:type="dxa" w:w="1337"/>
+          </w:tcPr>
+          <w:p>
+            <w:r>
+              <w:rPr>
+                <w:rFonts w:ascii="Times New Roman" w:hAnsi="Times New Roman"/>
+                <w:sz w:val="22"/>
+              </w:rPr>
+              <w:t>–</w:t>
+            </w:r>
+          </w:p>
+        </w:tc>
+      </w:tr>
+      <w:tr>
+        <w:tc>
+          <w:tcPr>
+            <w:tcW w:type="dxa" w:w="1337"/>
+          </w:tcPr>
+          <w:p>
+            <w:r>
+              <w:rPr>
+                <w:rFonts w:ascii="Times New Roman" w:hAnsi="Times New Roman"/>
+                <w:b/>
+                <w:sz w:val="22"/>
+              </w:rPr>
+              <w:t>Fold 4</w:t>
+            </w:r>
+          </w:p>
+        </w:tc>
+        <w:tc>
+          <w:tcPr>
+            <w:tcW w:type="dxa" w:w="1337"/>
+          </w:tcPr>
+          <w:p>
+            <w:r>
+              <w:rPr>
+                <w:rFonts w:ascii="Times New Roman" w:hAnsi="Times New Roman"/>
+                <w:sz w:val="22"/>
+              </w:rPr>
+              <w:t>–</w:t>
+            </w:r>
+          </w:p>
+        </w:tc>
+        <w:tc>
+          <w:tcPr>
+            <w:tcW w:type="dxa" w:w="1337"/>
+          </w:tcPr>
+          <w:p>
+            <w:r>
+              <w:rPr>
+                <w:rFonts w:ascii="Times New Roman" w:hAnsi="Times New Roman"/>
+                <w:sz w:val="22"/>
+              </w:rPr>
+              <w:t>–</w:t>
+            </w:r>
+          </w:p>
+        </w:tc>
+        <w:tc>
+          <w:tcPr>
+            <w:tcW w:type="dxa" w:w="1337"/>
+          </w:tcPr>
+          <w:p>
+            <w:r>
+              <w:rPr>
+                <w:rFonts w:ascii="Times New Roman" w:hAnsi="Times New Roman"/>
+                <w:sz w:val="22"/>
+              </w:rPr>
+              <w:t>–</w:t>
+            </w:r>
+          </w:p>
+        </w:tc>
+        <w:tc>
+          <w:tcPr>
+            <w:tcW w:type="dxa" w:w="1337"/>
+          </w:tcPr>
+          <w:p>
+            <w:r>
+              <w:rPr>
+                <w:rFonts w:ascii="Times New Roman" w:hAnsi="Times New Roman"/>
+                <w:sz w:val="22"/>
+              </w:rPr>
+              <w:t>–</w:t>
+            </w:r>
+          </w:p>
+        </w:tc>
+        <w:tc>
+          <w:tcPr>
+            <w:tcW w:type="dxa" w:w="1337"/>
+          </w:tcPr>
+          <w:p>
+            <w:r>
+              <w:rPr>
+                <w:rFonts w:ascii="Times New Roman" w:hAnsi="Times New Roman"/>
+                <w:sz w:val="22"/>
+              </w:rPr>
+              <w:t>–</w:t>
+            </w:r>
+          </w:p>
+        </w:tc>
+        <w:tc>
+          <w:tcPr>
+            <w:tcW w:type="dxa" w:w="1337"/>
+          </w:tcPr>
+          <w:p>
+            <w:r>
+              <w:rPr>
+                <w:rFonts w:ascii="Times New Roman" w:hAnsi="Times New Roman"/>
+                <w:sz w:val="22"/>
+              </w:rPr>
+              <w:t>–</w:t>
+            </w:r>
+          </w:p>
+        </w:tc>
+      </w:tr>
+      <w:tr>
+        <w:tc>
+          <w:tcPr>
+            <w:tcW w:type="dxa" w:w="1337"/>
+          </w:tcPr>
+          <w:p>
+            <w:r>
+              <w:rPr>
+                <w:rFonts w:ascii="Times New Roman" w:hAnsi="Times New Roman"/>
+                <w:b/>
+                <w:sz w:val="22"/>
+              </w:rPr>
+              <w:t>Mean ± SD</w:t>
+            </w:r>
+          </w:p>
+        </w:tc>
+        <w:tc>
+          <w:tcPr>
+            <w:tcW w:type="dxa" w:w="1337"/>
+          </w:tcPr>
+          <w:p>
+            <w:r>
+              <w:rPr>
+                <w:rFonts w:ascii="Times New Roman" w:hAnsi="Times New Roman"/>
+                <w:sz w:val="22"/>
+              </w:rPr>
+              <w:t>– ± –</w:t>
+            </w:r>
+          </w:p>
+        </w:tc>
+        <w:tc>
+          <w:tcPr>
+            <w:tcW w:type="dxa" w:w="1337"/>
+          </w:tcPr>
+          <w:p>
+            <w:r>
+              <w:rPr>
+                <w:rFonts w:ascii="Times New Roman" w:hAnsi="Times New Roman"/>
+                <w:sz w:val="22"/>
+              </w:rPr>
+              <w:t>– ± –</w:t>
+            </w:r>
+          </w:p>
+        </w:tc>
+        <w:tc>
+          <w:tcPr>
+            <w:tcW w:type="dxa" w:w="1337"/>
+          </w:tcPr>
+          <w:p>
+            <w:r>
+              <w:rPr>
+                <w:rFonts w:ascii="Times New Roman" w:hAnsi="Times New Roman"/>
+                <w:sz w:val="22"/>
+              </w:rPr>
+              <w:t>– ± –</w:t>
+            </w:r>
+          </w:p>
+        </w:tc>
+        <w:tc>
+          <w:tcPr>
+            <w:tcW w:type="dxa" w:w="1337"/>
+          </w:tcPr>
+          <w:p>
+            <w:r>
+              <w:rPr>
+                <w:rFonts w:ascii="Times New Roman" w:hAnsi="Times New Roman"/>
+                <w:sz w:val="22"/>
+              </w:rPr>
+              <w:t>– ± –</w:t>
+            </w:r>
+          </w:p>
+        </w:tc>
+        <w:tc>
+          <w:tcPr>
+            <w:tcW w:type="dxa" w:w="1337"/>
+          </w:tcPr>
+          <w:p>
+            <w:r>
+              <w:rPr>
+                <w:rFonts w:ascii="Times New Roman" w:hAnsi="Times New Roman"/>
+                <w:sz w:val="22"/>
+              </w:rPr>
+              <w:t>– ± –</w:t>
+            </w:r>
+          </w:p>
+        </w:tc>
+        <w:tc>
+          <w:tcPr>
+            <w:tcW w:type="dxa" w:w="1337"/>
+          </w:tcPr>
+          <w:p>
+            <w:r>
+              <w:rPr>
+                <w:rFonts w:ascii="Times New Roman" w:hAnsi="Times New Roman"/>
+                <w:sz w:val="22"/>
+              </w:rPr>
+              <w:t>– ± –</w:t>
+            </w:r>
+          </w:p>
+        </w:tc>
+      </w:tr>
+      <w:tr>
+        <w:tc>
+          <w:tcPr>
+            <w:tcW w:type="dxa" w:w="1337"/>
+          </w:tcPr>
+          <w:p>
+            <w:r>
+              <w:rPr>
+                <w:rFonts w:ascii="Times New Roman" w:hAnsi="Times New Roman"/>
+                <w:b/>
+                <w:sz w:val="22"/>
+              </w:rPr>
+              <w:t>Original test</w:t>
+            </w:r>
+          </w:p>
+        </w:tc>
+        <w:tc>
+          <w:tcPr>
+            <w:tcW w:type="dxa" w:w="1337"/>
+          </w:tcPr>
+          <w:p>
+            <w:r>
+              <w:rPr>
+                <w:rFonts w:ascii="Times New Roman" w:hAnsi="Times New Roman"/>
+                <w:sz w:val="22"/>
+              </w:rPr>
+              <w:t>0.957</w:t>
+            </w:r>
+          </w:p>
+        </w:tc>
+        <w:tc>
+          <w:tcPr>
+            <w:tcW w:type="dxa" w:w="1337"/>
+          </w:tcPr>
+          <w:p>
+            <w:r>
+              <w:rPr>
+                <w:rFonts w:ascii="Times New Roman" w:hAnsi="Times New Roman"/>
+                <w:sz w:val="22"/>
+              </w:rPr>
+              <w:t>0.544</w:t>
+            </w:r>
+          </w:p>
+        </w:tc>
+        <w:tc>
+          <w:tcPr>
+            <w:tcW w:type="dxa" w:w="1337"/>
+          </w:tcPr>
+          <w:p>
+            <w:r>
+              <w:rPr>
+                <w:rFonts w:ascii="Times New Roman" w:hAnsi="Times New Roman"/>
+                <w:sz w:val="22"/>
+              </w:rPr>
+              <w:t>1.049</w:t>
+            </w:r>
+          </w:p>
+        </w:tc>
+        <w:tc>
+          <w:tcPr>
+            <w:tcW w:type="dxa" w:w="1337"/>
+          </w:tcPr>
+          <w:p>
+            <w:r>
+              <w:rPr>
+                <w:rFonts w:ascii="Times New Roman" w:hAnsi="Times New Roman"/>
+                <w:sz w:val="22"/>
+              </w:rPr>
+              <w:t>1.000</w:t>
+            </w:r>
+          </w:p>
+        </w:tc>
+        <w:tc>
+          <w:tcPr>
+            <w:tcW w:type="dxa" w:w="1337"/>
+          </w:tcPr>
+          <w:p>
+            <w:r>
+              <w:rPr>
+                <w:rFonts w:ascii="Times New Roman" w:hAnsi="Times New Roman"/>
+                <w:sz w:val="22"/>
+              </w:rPr>
+              <w:t>0.094</w:t>
+            </w:r>
+          </w:p>
+        </w:tc>
+        <w:tc>
+          <w:tcPr>
+            <w:tcW w:type="dxa" w:w="1337"/>
+          </w:tcPr>
+          <w:p>
+            <w:r>
+              <w:rPr>
+                <w:rFonts w:ascii="Times New Roman" w:hAnsi="Times New Roman"/>
+                <w:sz w:val="22"/>
+              </w:rPr>
+              <w:t>0.591</w:t>
+            </w:r>
+          </w:p>
+        </w:tc>
+      </w:tr>
+    </w:tbl>
+    <w:p>
+      <w:pPr>
+        <w:spacing w:before="0" w:after="240" w:line="480" w:lineRule="exact"/>
+        <w:jc w:val="both"/>
+      </w:pPr>
+      <w:r>
+        <w:rPr>
+          <w:rFonts w:ascii="Times New Roman" w:hAnsi="Times New Roman"/>
+          <w:b w:val="0"/>
+          <w:i/>
+          <w:sz w:val="20"/>
+        </w:rPr>
+        <w:t>After running the 5-fold pipeline, update this table by running: python outputs/kfold_figures.py  — then regenerate this document.</w:t>
+      </w:r>
+    </w:p>
     <w:sectPr>
       <w:headerReference w:type="default" r:id="rId9"/>
       <w:footerReference w:type="default" r:id="rId10"/>

</xml_diff>